<commit_message>
Refactor visual completo: cabecera, tema oscuro, footer animado y mejoras de usabilidad
</commit_message>
<xml_diff>
--- a/PortadaPhonoSyncAI.docx
+++ b/PortadaPhonoSyncAI.docx
@@ -234,6 +234,7 @@
           <w:b/>
           <w:sz w:val="34"/>
           <w:szCs w:val="34"/>
+          <w:u w:val="single"/>
         </w:rPr>
       </w:pPr>
       <w:r>
@@ -243,16 +244,7 @@
           <w:sz w:val="34"/>
           <w:szCs w:val="34"/>
         </w:rPr>
-        <w:t>Título</w:t>
-      </w:r>
-      <w:r>
-        <w:rPr>
-          <w:rFonts w:ascii="Arial" w:hAnsi="Arial" w:cs="Arial"/>
-          <w:b/>
-          <w:sz w:val="34"/>
-          <w:szCs w:val="34"/>
-        </w:rPr>
-        <w:t xml:space="preserve"> del proyecto</w:t>
+        <w:t>PhonoSyncAI</w:t>
       </w:r>
     </w:p>
     <w:p>

</xml_diff>